<commit_message>
Claudinho: revisão da Parte 5 (processo criminal e absolvição verificados)
Co-Authored-By: Claude Opus 5.5 <noreply@anthropic.com>
Claude-Session: https://claude.ai/code/session_01MJjUEEZrxQDEUifKK2vj9g
</commit_message>
<xml_diff>
--- a/roteiros/claudinho/Claudinho_Parte5.docx
+++ b/roteiros/claudinho/Claudinho_Parte5.docx
@@ -71,7 +71,7 @@
         <w:rPr>
           <w:color w:val="000000"/>
         </w:rPr>
-        <w:t>Ivan chegou a responder na Justiça pela morte do cantor.</w:t>
+        <w:t>Dois anos depois do acidente, a Justiça entrou na história.</w:t>
       </w:r>
     </w:p>
     <w:p>
@@ -79,7 +79,87 @@
         <w:rPr>
           <w:color w:val="000000"/>
         </w:rPr>
-        <w:t>Foi absolvido.</w:t>
+        <w:t>Agosto de dois mil e quatro.</w:t>
+      </w:r>
+    </w:p>
+    <w:p>
+      <w:r>
+        <w:rPr>
+          <w:color w:val="000000"/>
+        </w:rPr>
+        <w:t>O Ministério Público do Rio de Janeiro denunciou Ivan Manzieri por homicídio culposo na direção de um veículo. Ivan tinha sessenta e sete anos.</w:t>
+      </w:r>
+    </w:p>
+    <w:p>
+      <w:r>
+        <w:rPr>
+          <w:color w:val="000000"/>
+        </w:rPr>
+        <w:t>A denúncia dizia que ele dirigia rápido demais para aquelas condições, com chuva e pista molhada. Que fez uma manobra brusca para a direita sem frear. E que estava cansado, porque tinha dirigido de madrugada, depois do show em Lorena, sem dormir.</w:t>
+      </w:r>
+    </w:p>
+    <w:p>
+      <w:r>
+        <w:rPr>
+          <w:color w:val="000000"/>
+        </w:rPr>
+        <w:t>A Justiça de Seropédica aceitou a denúncia.</w:t>
+      </w:r>
+    </w:p>
+    <w:p>
+      <w:r>
+        <w:rPr>
+          <w:color w:val="000000"/>
+        </w:rPr>
+        <w:t>O homem chamado de assassino no velório agora era réu.</w:t>
+      </w:r>
+    </w:p>
+    <w:p>
+      <w:r>
+        <w:rPr>
+          <w:color w:val="000000"/>
+        </w:rPr>
+        <w:t>O processo correu por quase dois anos.</w:t>
+      </w:r>
+    </w:p>
+    <w:p>
+      <w:r>
+        <w:rPr>
+          <w:color w:val="000000"/>
+        </w:rPr>
+        <w:t>E, no meio dele, aconteceu uma coisa que pouca gente esperava.</w:t>
+      </w:r>
+    </w:p>
+    <w:p>
+      <w:r>
+        <w:rPr>
+          <w:color w:val="000000"/>
+        </w:rPr>
+        <w:t>Os peritos tinham examinado o local do acidente. Nos cinquenta metros antes do ponto de impacto, não encontraram marcas de frenagem nem sinais de colisão. Nada que indicasse que o motorista vinha dirigindo de forma imprudente. Testemunhas reforçaram essa conclusão.</w:t>
+      </w:r>
+    </w:p>
+    <w:p>
+      <w:r>
+        <w:rPr>
+          <w:color w:val="000000"/>
+        </w:rPr>
+        <w:t>Diante disso, o próprio Ministério Público, que tinha acusado Ivan, mudou de posição. Concluiu que ele não podia ser responsabilizado. Para os promotores, tinha sido uma fatalidade.</w:t>
+      </w:r>
+    </w:p>
+    <w:p>
+      <w:r>
+        <w:rPr>
+          <w:color w:val="000000"/>
+        </w:rPr>
+        <w:t>Onze de julho de dois mil e seis. Dois dias antes de a morte de Claudinho completar quatro anos.</w:t>
+      </w:r>
+    </w:p>
+    <w:p>
+      <w:r>
+        <w:rPr>
+          <w:color w:val="000000"/>
+        </w:rPr>
+        <w:t>O juiz de Seropédica absolveu Ivan Manzieri.</w:t>
       </w:r>
     </w:p>
     <w:p>
@@ -119,7 +199,7 @@
         <w:rPr>
           <w:color w:val="000000"/>
         </w:rPr>
-        <w:t>Era exatamente a acusação que a multidão tinha gritado no velório, agora escrita num processo.</w:t>
+        <w:t>Era a mesma acusação que já tinha sido derrubada no processo criminal, agora repetida pelos advogados da empresa.</w:t>
       </w:r>
     </w:p>
     <w:p>
@@ -271,7 +351,7 @@
         <w:rPr>
           <w:color w:val="000000"/>
         </w:rPr>
-        <w:t>A Justiça, depois de analisar a estrada, apontou para uma árvore sem proteção, plantada a dois metros de um obstáculo, numa das descidas mais perigosas do país.</w:t>
+        <w:t>A Justiça, depois de analisar a estrada, apontou para uma árvore sem proteção, plantada a dois metros de um obstáculo, numa descida perigosa da serra.</w:t>
       </w:r>
     </w:p>
     <w:p>

</xml_diff>